<commit_message>
cambio en la programación
</commit_message>
<xml_diff>
--- a/Programación Anual Unidades, Tareas y Cuestionarios 2026-2027.docx
+++ b/Programación Anual Unidades, Tareas y Cuestionarios 2026-2027.docx
@@ -2677,6 +2677,13 @@
                 <w:spacing w:val="-2"/>
                 <w:sz w:val="24"/>
               </w:rPr>
+              <w:t>0</w:t>
+            </w:r>
+            <w:r>
+              <w:rPr>
+                <w:spacing w:val="-2"/>
+                <w:sz w:val="24"/>
+              </w:rPr>
               <w:t>9</w:t>
             </w:r>
             <w:r>
@@ -2685,6 +2692,13 @@
                 <w:sz w:val="24"/>
               </w:rPr>
               <w:t>/</w:t>
+            </w:r>
+            <w:r>
+              <w:rPr>
+                <w:spacing w:val="-2"/>
+                <w:sz w:val="24"/>
+              </w:rPr>
+              <w:t>0</w:t>
             </w:r>
             <w:r>
               <w:rPr>
@@ -2741,6 +2755,13 @@
                 <w:spacing w:val="-2"/>
                 <w:sz w:val="24"/>
               </w:rPr>
+              <w:t>0</w:t>
+            </w:r>
+            <w:r>
+              <w:rPr>
+                <w:spacing w:val="-2"/>
+                <w:sz w:val="24"/>
+              </w:rPr>
               <w:t>1</w:t>
             </w:r>
             <w:r>
@@ -2777,6 +2798,13 @@
                 <w:spacing w:val="-2"/>
                 <w:sz w:val="24"/>
               </w:rPr>
+              <w:t>0</w:t>
+            </w:r>
+            <w:r>
+              <w:rPr>
+                <w:spacing w:val="-2"/>
+                <w:sz w:val="24"/>
+              </w:rPr>
               <w:t>9</w:t>
             </w:r>
             <w:r>
@@ -2785,6 +2813,13 @@
                 <w:sz w:val="24"/>
               </w:rPr>
               <w:t>/</w:t>
+            </w:r>
+            <w:r>
+              <w:rPr>
+                <w:spacing w:val="-2"/>
+                <w:sz w:val="24"/>
+              </w:rPr>
+              <w:t>0</w:t>
             </w:r>
             <w:r>
               <w:rPr>
@@ -2911,6 +2946,13 @@
                 <w:spacing w:val="-2"/>
                 <w:sz w:val="24"/>
               </w:rPr>
+              <w:t>0</w:t>
+            </w:r>
+            <w:r>
+              <w:rPr>
+                <w:spacing w:val="-2"/>
+                <w:sz w:val="24"/>
+              </w:rPr>
               <w:t>2</w:t>
             </w:r>
             <w:r>
@@ -2954,7 +2996,7 @@
                 <w:spacing w:val="-2"/>
                 <w:sz w:val="24"/>
               </w:rPr>
-              <w:t>4</w:t>
+              <w:t>7</w:t>
             </w:r>
             <w:r>
               <w:rPr>
@@ -2962,6 +3004,13 @@
                 <w:sz w:val="24"/>
               </w:rPr>
               <w:t>/</w:t>
+            </w:r>
+            <w:r>
+              <w:rPr>
+                <w:spacing w:val="-2"/>
+                <w:sz w:val="24"/>
+              </w:rPr>
+              <w:t>0</w:t>
             </w:r>
             <w:r>
               <w:rPr>
@@ -3018,6 +3067,13 @@
                 <w:spacing w:val="-2"/>
                 <w:sz w:val="24"/>
               </w:rPr>
+              <w:t>0</w:t>
+            </w:r>
+            <w:r>
+              <w:rPr>
+                <w:spacing w:val="-2"/>
+                <w:sz w:val="24"/>
+              </w:rPr>
               <w:t>2</w:t>
             </w:r>
             <w:r>
@@ -3061,7 +3117,21 @@
                 <w:spacing w:val="-2"/>
                 <w:sz w:val="24"/>
               </w:rPr>
+              <w:t>7</w:t>
+            </w:r>
+            <w:r>
+              <w:rPr>
+                <w:spacing w:val="-2"/>
+                <w:sz w:val="24"/>
+              </w:rPr>
               <w:t>/</w:t>
+            </w:r>
+            <w:r>
+              <w:rPr>
+                <w:spacing w:val="-2"/>
+                <w:sz w:val="24"/>
+              </w:rPr>
+              <w:t>0</w:t>
             </w:r>
             <w:r>
               <w:rPr>

</xml_diff>